<commit_message>
Update assignment title page
Co-authored-by: ernestkurdziel-max <ernestkurdziel-max@users.noreply.github.com>
</commit_message>
<xml_diff>
--- a/zasady_planowania_fizjoterapii_mukowiscydoza.docx
+++ b/zasady_planowania_fizjoterapii_mukowiscydoza.docx
@@ -4,87 +4,180 @@
   <w:body>
     <w:p>
       <w:pPr>
+        <w:spacing w:before="0" w:after="360" w:line="240" w:lineRule="auto"/>
         <w:jc w:val="center"/>
       </w:pPr>
       <w:r>
-        <w:br/>
-        <w:br/>
-        <w:br/>
+        <w:drawing>
+          <wp:inline xmlns:a="http://schemas.openxmlformats.org/drawingml/2006/main" xmlns:pic="http://schemas.openxmlformats.org/drawingml/2006/picture">
+            <wp:extent cx="5328000" cy="1709804"/>
+            <wp:docPr id="1" name="Picture 1"/>
+            <wp:cNvGraphicFramePr>
+              <a:graphicFrameLocks noChangeAspect="1"/>
+            </wp:cNvGraphicFramePr>
+            <a:graphic>
+              <a:graphicData uri="http://schemas.openxmlformats.org/drawingml/2006/picture">
+                <pic:pic>
+                  <pic:nvPicPr>
+                    <pic:cNvPr id="0" name="page18_1.png"/>
+                    <pic:cNvPicPr/>
+                  </pic:nvPicPr>
+                  <pic:blipFill>
+                    <a:blip r:embed="rId11"/>
+                    <a:stretch>
+                      <a:fillRect/>
+                    </a:stretch>
+                  </pic:blipFill>
+                  <pic:spPr>
+                    <a:xfrm>
+                      <a:off x="0" y="0"/>
+                      <a:ext cx="5328000" cy="1709804"/>
+                    </a:xfrm>
+                    <a:prstGeom prst="rect"/>
+                  </pic:spPr>
+                </pic:pic>
+              </a:graphicData>
+            </a:graphic>
+          </wp:inline>
+        </w:drawing>
       </w:r>
     </w:p>
     <w:p>
       <w:pPr>
+        <w:spacing w:before="0" w:after="0" w:line="240" w:lineRule="auto"/>
         <w:jc w:val="center"/>
       </w:pPr>
       <w:r>
         <w:rPr>
+          <w:rFonts w:ascii="Times New Roman" w:hAnsi="Times New Roman" w:eastAsia="Times New Roman"/>
           <w:b/>
-          <w:color w:val="1F4E79"/>
-          <w:sz w:val="44"/>
+          <w:i w:val="0"/>
+          <w:color w:val="000000"/>
+          <w:sz w:val="32"/>
+        </w:rPr>
+        <w:t>KOLEGIUM MEDYCZNE</w:t>
+      </w:r>
+      <w:r>
+        <w:br/>
+      </w:r>
+      <w:r>
+        <w:rPr>
+          <w:rFonts w:ascii="Times New Roman" w:hAnsi="Times New Roman" w:eastAsia="Times New Roman"/>
+          <w:b/>
+          <w:i w:val="0"/>
+          <w:color w:val="000000"/>
+          <w:sz w:val="32"/>
+        </w:rPr>
+        <w:t>Kierunek: FIZJOTERAPIA</w:t>
+      </w:r>
+    </w:p>
+    <w:p>
+      <w:pPr>
+        <w:spacing w:before="1440" w:after="0" w:line="240" w:lineRule="auto"/>
+        <w:jc w:val="center"/>
+      </w:pPr>
+      <w:r>
+        <w:rPr>
+          <w:rFonts w:ascii="Times New Roman" w:hAnsi="Times New Roman" w:eastAsia="Times New Roman"/>
+          <w:b w:val="0"/>
+          <w:i w:val="0"/>
+          <w:color w:val="000000"/>
+          <w:sz w:val="30"/>
+        </w:rPr>
+        <w:t>Ernest Kurdziel</w:t>
+      </w:r>
+      <w:r>
+        <w:br/>
+      </w:r>
+      <w:r>
+        <w:rPr>
+          <w:rFonts w:ascii="Times New Roman" w:hAnsi="Times New Roman" w:eastAsia="Times New Roman"/>
+          <w:b w:val="0"/>
+          <w:i w:val="0"/>
+          <w:color w:val="000000"/>
+          <w:sz w:val="30"/>
+        </w:rPr>
+        <w:t>Nr albumu studenta: 72714</w:t>
+      </w:r>
+    </w:p>
+    <w:p>
+      <w:pPr>
+        <w:spacing w:before="240" w:after="0" w:line="240" w:lineRule="auto"/>
+        <w:jc w:val="center"/>
+      </w:pPr>
+      <w:r>
+        <w:rPr>
+          <w:rFonts w:ascii="Times New Roman" w:hAnsi="Times New Roman" w:eastAsia="Times New Roman"/>
+          <w:b/>
+          <w:i/>
+          <w:color w:val="000000"/>
+          <w:sz w:val="40"/>
         </w:rPr>
         <w:t>Zasady planowania i programowania fizjoterapii pacjentów</w:t>
         <w:br/>
         <w:t>z chorobami układu oddechowego</w:t>
       </w:r>
-    </w:p>
-    <w:p>
-      <w:pPr>
-        <w:jc w:val="center"/>
-      </w:pPr>
+      <w:r>
+        <w:br/>
+      </w:r>
       <w:r>
         <w:rPr>
+          <w:rFonts w:ascii="Times New Roman" w:hAnsi="Times New Roman" w:eastAsia="Times New Roman"/>
           <w:b/>
-          <w:color w:val="2F5597"/>
-          <w:sz w:val="36"/>
+          <w:i/>
+          <w:color w:val="000000"/>
+          <w:sz w:val="32"/>
         </w:rPr>
-        <w:br/>
         <w:t>na przykładzie mukowiscydozy</w:t>
       </w:r>
     </w:p>
     <w:p>
       <w:pPr>
+        <w:spacing w:before="320" w:after="0" w:line="240" w:lineRule="auto"/>
         <w:jc w:val="center"/>
       </w:pPr>
       <w:r>
         <w:rPr>
-          <w:sz w:val="26"/>
+          <w:rFonts w:ascii="Times New Roman" w:hAnsi="Times New Roman" w:eastAsia="Times New Roman"/>
+          <w:b w:val="0"/>
+          <w:i w:val="0"/>
+          <w:color w:val="000000"/>
+          <w:sz w:val="24"/>
         </w:rPr>
-        <w:br/>
-        <w:t>Praca pisemna</w:t>
+        <w:t>Nauczyciel prowadzący: dr Weronika Cyganik</w:t>
       </w:r>
     </w:p>
     <w:p>
       <w:pPr>
+        <w:spacing w:before="1720" w:after="0" w:line="240" w:lineRule="auto"/>
         <w:jc w:val="center"/>
       </w:pPr>
       <w:r>
         <w:rPr>
+          <w:rFonts w:ascii="Times New Roman" w:hAnsi="Times New Roman" w:eastAsia="Times New Roman"/>
           <w:b/>
+          <w:i w:val="0"/>
+          <w:color w:val="000000"/>
+          <w:sz w:val="38"/>
         </w:rPr>
-        <w:br/>
-        <w:br/>
-        <w:t xml:space="preserve">Wybrana jednostka chorobowa: </w:t>
-      </w:r>
-      <w:r>
-        <w:t>mukowiscydoza (cystic fibrosis, CF)</w:t>
+        <w:t>PRACA ZALICZENIOWA</w:t>
       </w:r>
     </w:p>
     <w:p>
       <w:pPr>
+        <w:spacing w:before="1680" w:after="0" w:line="240" w:lineRule="auto"/>
         <w:jc w:val="center"/>
       </w:pPr>
       <w:r>
         <w:rPr>
+          <w:rFonts w:ascii="Times New Roman" w:hAnsi="Times New Roman" w:eastAsia="Times New Roman"/>
           <w:b/>
+          <w:i w:val="0"/>
+          <w:color w:val="000000"/>
+          <w:sz w:val="28"/>
         </w:rPr>
-        <w:br/>
-        <w:t xml:space="preserve">Data opracowania: </w:t>
+        <w:t>Rzeszów 2026</w:t>
       </w:r>
-      <w:r>
-        <w:t>22 czerwca 2026 r.</w:t>
-      </w:r>
-    </w:p>
-    <w:p>
       <w:r>
         <w:br w:type="page"/>
       </w:r>
@@ -3542,9 +3635,11 @@
     </w:p>
     <w:sectPr>
       <w:footerReference w:type="default" r:id="rId9"/>
+      <w:footerReference w:type="first" r:id="rId10"/>
       <w:pgSz w:w="12240" w:h="15840"/>
-      <w:pgMar w:top="1417" w:right="1417" w:bottom="1417" w:left="1417" w:header="720" w:footer="720" w:gutter="0"/>
+      <w:pgMar w:top="850" w:right="1134" w:bottom="850" w:left="1134" w:header="720" w:footer="720" w:gutter="0"/>
       <w:cols w:space="720"/>
+      <w:titlePg/>
       <w:docGrid w:linePitch="360"/>
     </w:sectPr>
   </w:body>
@@ -3566,6 +3661,16 @@
         <w:t>1</w:t>
       </w:r>
     </w:fldSimple>
+  </w:p>
+</w:ftr>
+</file>
+
+<file path=word/footer2.xml><?xml version="1.0" encoding="utf-8"?>
+<w:ftr xmlns:m="http://schemas.openxmlformats.org/officeDocument/2006/math" xmlns:mc="http://schemas.openxmlformats.org/markup-compatibility/2006" xmlns:mo="http://schemas.microsoft.com/office/mac/office/2008/main" xmlns:mv="urn:schemas-microsoft-com:mac:vml" xmlns:o="urn:schemas-microsoft-com:office:office" xmlns:r="http://schemas.openxmlformats.org/officeDocument/2006/relationships" xmlns:v="urn:schemas-microsoft-com:vml" xmlns:w10="urn:schemas-microsoft-com:office:word" xmlns:w14="http://schemas.microsoft.com/office/word/2010/wordml" xmlns:w="http://schemas.openxmlformats.org/wordprocessingml/2006/main" xmlns:wne="http://schemas.microsoft.com/office/word/2006/wordml" xmlns:wp14="http://schemas.microsoft.com/office/word/2010/wordprocessingDrawing" xmlns:wp="http://schemas.openxmlformats.org/drawingml/2006/wordprocessingDrawing" xmlns:wpc="http://schemas.microsoft.com/office/word/2010/wordprocessingCanvas" xmlns:wpg="http://schemas.microsoft.com/office/word/2010/wordprocessingGroup" xmlns:wpi="http://schemas.microsoft.com/office/word/2010/wordprocessingInk" xmlns:wps="http://schemas.microsoft.com/office/word/2010/wordprocessingShape" mc:Ignorable="w14 wp14">
+  <w:p>
+    <w:pPr>
+      <w:pStyle w:val="Footer"/>
+    </w:pPr>
   </w:p>
 </w:ftr>
 </file>

</xml_diff>